<commit_message>
Add market maker simulation script and update research report
</commit_message>
<xml_diff>
--- a/Final Report/Market Making and Inventory Risk - Research Report.docx
+++ b/Final Report/Market Making and Inventory Risk - Research Report.docx
@@ -760,19 +760,7 @@
         <w:rPr>
           <w:rFonts w:ascii="Times New Roman" w:hAnsi="Times New Roman" w:cs="Times New Roman"/>
         </w:rPr>
-        <w:t>Let S = 100,</w:t>
-      </w:r>
-      <w:r>
-        <w:rPr>
-          <w:rFonts w:ascii="Times New Roman" w:hAnsi="Times New Roman" w:cs="Times New Roman"/>
-        </w:rPr>
-        <w:t xml:space="preserve"> </w:t>
-      </w:r>
-      <w:r>
-        <w:rPr>
-          <w:rFonts w:ascii="Times New Roman" w:hAnsi="Times New Roman" w:cs="Times New Roman"/>
-        </w:rPr>
-        <w:t>k = 0.1</w:t>
+        <w:t>Let S = 100, k = 0.1</w:t>
       </w:r>
     </w:p>
     <w:p>
@@ -1478,6 +1466,69 @@
       <w:pPr>
         <w:rPr>
           <w:rFonts w:ascii="Times New Roman" w:hAnsi="Times New Roman" w:cs="Times New Roman"/>
+          <w:b/>
+          <w:bCs/>
+        </w:rPr>
+      </w:pPr>
+      <w:r>
+        <w:rPr>
+          <w:rFonts w:ascii="Times New Roman" w:hAnsi="Times New Roman" w:cs="Times New Roman"/>
+          <w:b/>
+          <w:bCs/>
+        </w:rPr>
+        <w:t>Python Simulation</w:t>
+      </w:r>
+    </w:p>
+    <w:p>
+      <w:pPr>
+        <w:rPr>
+          <w:rFonts w:ascii="Times New Roman" w:hAnsi="Times New Roman" w:cs="Times New Roman"/>
+        </w:rPr>
+      </w:pPr>
+      <w:r>
+        <w:rPr>
+          <w:rFonts w:ascii="Times New Roman" w:hAnsi="Times New Roman" w:cs="Times New Roman"/>
+        </w:rPr>
+        <w:t xml:space="preserve">An Excel model is useful for constructing the market-making strategy step by step and checking that each part of the model behaved correctly. </w:t>
+      </w:r>
+    </w:p>
+    <w:p>
+      <w:pPr>
+        <w:rPr>
+          <w:rFonts w:ascii="Times New Roman" w:hAnsi="Times New Roman" w:cs="Times New Roman"/>
+        </w:rPr>
+      </w:pPr>
+      <w:r>
+        <w:rPr>
+          <w:rFonts w:ascii="Times New Roman" w:hAnsi="Times New Roman" w:cs="Times New Roman"/>
+        </w:rPr>
+        <w:t xml:space="preserve">For making the model more scalable, a Python implementation is used and reproduces the same rules developed in Excel. </w:t>
+      </w:r>
+    </w:p>
+    <w:p>
+      <w:pPr>
+        <w:rPr>
+          <w:rFonts w:ascii="Times New Roman" w:hAnsi="Times New Roman" w:cs="Times New Roman"/>
+        </w:rPr>
+      </w:pPr>
+    </w:p>
+    <w:p>
+      <w:pPr>
+        <w:rPr>
+          <w:rFonts w:ascii="Times New Roman" w:hAnsi="Times New Roman" w:cs="Times New Roman"/>
+        </w:rPr>
+      </w:pPr>
+      <w:r>
+        <w:rPr>
+          <w:rFonts w:ascii="Times New Roman" w:hAnsi="Times New Roman" w:cs="Times New Roman"/>
+        </w:rPr>
+        <w:t>A single simulation is highly dependent on random outcomes. Therefore it is required for the Python model to extend to be ran repeatedly. Each run returns final PnL and maximum absolute inventory. These results are stored and averaged across many simulations. Repeated simulation gives a more useful picture of typical behaviour than one path alone. Extreme outcomes such as worst PnL are also recorded.</w:t>
+      </w:r>
+    </w:p>
+    <w:p>
+      <w:pPr>
+        <w:rPr>
+          <w:rFonts w:ascii="Times New Roman" w:hAnsi="Times New Roman" w:cs="Times New Roman"/>
         </w:rPr>
       </w:pPr>
     </w:p>
@@ -1680,6 +1731,7 @@
           <w:b/>
           <w:bCs/>
         </w:rPr>
+        <w:lastRenderedPageBreak/>
         <w:t>Weakness of the Baseline Strategy</w:t>
       </w:r>
     </w:p>
@@ -1817,7 +1869,6 @@
         <w:rPr>
           <w:rFonts w:ascii="Times New Roman" w:hAnsi="Times New Roman" w:cs="Times New Roman"/>
         </w:rPr>
-        <w:lastRenderedPageBreak/>
         <w:t xml:space="preserve">Our new PnL is now -295 + 3(96) = -7. So, the strategy goes from +5 to -7, because it accumulated too much inventory. This is the key weakness of the baseline strategy. The strategy can keep accumulating inventory because its quoting behaviour does not change as inventory grows. </w:t>
       </w:r>
     </w:p>
@@ -2017,6 +2068,7 @@
         <w:rPr>
           <w:rFonts w:ascii="Times New Roman" w:hAnsi="Times New Roman" w:cs="Times New Roman"/>
         </w:rPr>
+        <w:lastRenderedPageBreak/>
         <w:t>Ask = S – kq + h</w:t>
       </w:r>
     </w:p>
@@ -2093,14 +2145,7 @@
         <w:rPr>
           <w:rFonts w:ascii="Times New Roman" w:hAnsi="Times New Roman" w:cs="Times New Roman"/>
         </w:rPr>
-        <w:t xml:space="preserve">Now a customer decides to sell to us at the bid 99, so cash = -99, q = +1. Our baseline strategy still quotes 99 | 101, our inventory-aware strategy now centres C at 99.5 . Therefore, </w:t>
-      </w:r>
-      <w:r>
-        <w:rPr>
-          <w:rFonts w:ascii="Times New Roman" w:hAnsi="Times New Roman" w:cs="Times New Roman"/>
-        </w:rPr>
-        <w:lastRenderedPageBreak/>
-        <w:t>Bid = 98.5, Ask = 100.5 . So, our new quote is 98.5 | 100.5 .</w:t>
+        <w:t>Now a customer decides to sell to us at the bid 99, so cash = -99, q = +1. Our baseline strategy still quotes 99 | 101, our inventory-aware strategy now centres C at 99.5 . Therefore, Bid = 98.5, Ask = 100.5 . So, our new quote is 98.5 | 100.5 .</w:t>
       </w:r>
       <w:r>
         <w:rPr>
@@ -2262,6 +2307,7 @@
         <w:rPr>
           <w:rFonts w:ascii="Times New Roman" w:hAnsi="Times New Roman" w:cs="Times New Roman"/>
         </w:rPr>
+        <w:lastRenderedPageBreak/>
         <w:t>Each strategy was evaluated over 20 trades using the same realised price movements and random draws. Performance was assessed using final PnL, maximum absolute inventory, and final absolute inventory.</w:t>
       </w:r>
     </w:p>
@@ -2316,7 +2362,6 @@
           <w:kern w:val="0"/>
           <w14:ligatures w14:val="none"/>
         </w:rPr>
-        <w:lastRenderedPageBreak/>
         <w:t>Controlled Strategy Comparison</w:t>
       </w:r>
     </w:p>
@@ -2643,6 +2688,7 @@
               <w:pStyle w:val="NormalWeb"/>
             </w:pPr>
             <w:r>
+              <w:lastRenderedPageBreak/>
               <w:t>Worst observed final PnL</w:t>
             </w:r>
           </w:p>
@@ -2976,6 +3022,7 @@
         <w:rPr>
           <w:rFonts w:ascii="Times New Roman" w:hAnsi="Times New Roman" w:cs="Times New Roman"/>
         </w:rPr>
+        <w:lastRenderedPageBreak/>
         <w:t xml:space="preserve">Each test used the same 20 trade scenario. Order and price random draws remained frozen, and all parameters were unchanged. Recordings include final PnL, maximum absolute inventory and final absolute inventory as fixed values for each value of k. </w:t>
       </w:r>
     </w:p>
@@ -2995,8 +3042,8 @@
       <w:r>
         <w:rPr>
           <w:rFonts w:ascii="Times New Roman" w:hAnsi="Times New Roman" w:cs="Times New Roman"/>
-        </w:rPr>
-        <w:lastRenderedPageBreak/>
+          <w:noProof/>
+        </w:rPr>
         <w:drawing>
           <wp:inline distT="0" distB="0" distL="0" distR="0" wp14:anchorId="4315A7F2" wp14:editId="47069EB0">
             <wp:extent cx="5731510" cy="2157095"/>
@@ -3043,6 +3090,7 @@
       <w:r>
         <w:rPr>
           <w:rFonts w:ascii="Times New Roman" w:hAnsi="Times New Roman" w:cs="Times New Roman"/>
+          <w:noProof/>
         </w:rPr>
         <w:drawing>
           <wp:inline distT="0" distB="0" distL="0" distR="0" wp14:anchorId="03DA637D" wp14:editId="4F81B658">
@@ -3181,14 +3229,7 @@
         <w:rPr>
           <w:rFonts w:ascii="Times New Roman" w:hAnsi="Times New Roman" w:cs="Times New Roman"/>
         </w:rPr>
-        <w:t xml:space="preserve">Four values were tested: 0.5, 1, 2, 3. Each run used the same frozen order draws and price directions. All four runs produced final PnL of 19.50, maximum absolute inventory of 4 and </w:t>
-      </w:r>
-      <w:r>
-        <w:rPr>
-          <w:rFonts w:ascii="Times New Roman" w:hAnsi="Times New Roman" w:cs="Times New Roman"/>
-        </w:rPr>
-        <w:lastRenderedPageBreak/>
-        <w:t xml:space="preserve">final absolute inventory of 4. In this scenario, the inventory-related prices gains and losses offset by the final trade. </w:t>
+        <w:t xml:space="preserve">Four values were tested: 0.5, 1, 2, 3. Each run used the same frozen order draws and price directions. All four runs produced final PnL of 19.50, maximum absolute inventory of 4 and final absolute inventory of 4. In this scenario, the inventory-related prices gains and losses offset by the final trade. </w:t>
       </w:r>
     </w:p>
     <w:p>
@@ -3315,6 +3356,7 @@
         <w:pStyle w:val="NormalWeb"/>
       </w:pPr>
       <w:r>
+        <w:lastRenderedPageBreak/>
         <w:t>This scenario shows a trade-off between restricting inventory exposure and accepting trading opportunities. Again, further tests would be needed to assess profitability and risk more broadly.</w:t>
       </w:r>
     </w:p>
@@ -3336,7 +3378,6 @@
           <w:b/>
           <w:bCs/>
         </w:rPr>
-        <w:lastRenderedPageBreak/>
         <w:t>Spread Width</w:t>
       </w:r>
     </w:p>
@@ -3482,6 +3523,9 @@
         <w:pStyle w:val="NormalWeb"/>
       </w:pPr>
       <w:r>
+        <w:rPr>
+          <w:noProof/>
+        </w:rPr>
         <w:lastRenderedPageBreak/>
         <w:drawing>
           <wp:inline distT="0" distB="0" distL="0" distR="0" wp14:anchorId="079DB435" wp14:editId="19517389">

</xml_diff>

<commit_message>
Refactor market maker simulation: separate scenario generation and enhance simulation logic
</commit_message>
<xml_diff>
--- a/Final Report/Market Making and Inventory Risk - Research Report.docx
+++ b/Final Report/Market Making and Inventory Risk - Research Report.docx
@@ -1538,6 +1538,65 @@
           <w:rFonts w:ascii="Times New Roman" w:hAnsi="Times New Roman" w:cs="Times New Roman"/>
         </w:rPr>
       </w:pPr>
+      <w:r>
+        <w:rPr>
+          <w:rFonts w:ascii="Times New Roman" w:hAnsi="Times New Roman" w:cs="Times New Roman"/>
+        </w:rPr>
+        <w:t>If one strategy sees +1, +1, -1, +1, … and the other sees -1, -1, +1, -1, …, comparing their PnL will be messy.</w:t>
+      </w:r>
+    </w:p>
+    <w:p>
+      <w:pPr>
+        <w:rPr>
+          <w:rFonts w:ascii="Times New Roman" w:hAnsi="Times New Roman" w:cs="Times New Roman"/>
+        </w:rPr>
+      </w:pPr>
+      <w:r>
+        <w:rPr>
+          <w:rFonts w:ascii="Times New Roman" w:hAnsi="Times New Roman" w:cs="Times New Roman"/>
+        </w:rPr>
+        <w:t xml:space="preserve">We want same price moves, same trade draws, same order draws, but different ‘k’. So the only thing to change is the strategy. This is a paired experiment. </w:t>
+      </w:r>
+    </w:p>
+    <w:p>
+      <w:pPr>
+        <w:rPr>
+          <w:rFonts w:ascii="Times New Roman" w:hAnsi="Times New Roman" w:cs="Times New Roman"/>
+        </w:rPr>
+      </w:pPr>
+      <w:r>
+        <w:rPr>
+          <w:rFonts w:ascii="Times New Roman" w:hAnsi="Times New Roman" w:cs="Times New Roman"/>
+        </w:rPr>
+        <w:t xml:space="preserve">Comparing strategies on independently generated path introduces unnecessary randomness. </w:t>
+      </w:r>
+      <w:r>
+        <w:rPr>
+          <w:rFonts w:ascii="Times New Roman" w:hAnsi="Times New Roman" w:cs="Times New Roman"/>
+        </w:rPr>
+        <w:t xml:space="preserve">Each simulation therefore generates one market scenario first, that exact scenario is then passed to both the baseline and inventory-aware strategies. The price moves and random customer draws are identical for both. The main strategic difference is ‘k’, this created a more controlled comparison. Differences in PnL and maximum inventory can then be measured scenario by scenario. </w:t>
+      </w:r>
+    </w:p>
+    <w:p>
+      <w:pPr>
+        <w:rPr>
+          <w:rFonts w:ascii="Times New Roman" w:hAnsi="Times New Roman" w:cs="Times New Roman"/>
+        </w:rPr>
+      </w:pPr>
+    </w:p>
+    <w:p>
+      <w:pPr>
+        <w:rPr>
+          <w:rFonts w:ascii="Times New Roman" w:hAnsi="Times New Roman" w:cs="Times New Roman"/>
+        </w:rPr>
+      </w:pPr>
+    </w:p>
+    <w:p>
+      <w:pPr>
+        <w:rPr>
+          <w:rFonts w:ascii="Times New Roman" w:hAnsi="Times New Roman" w:cs="Times New Roman"/>
+        </w:rPr>
+      </w:pPr>
     </w:p>
     <w:p>
       <w:pPr>
@@ -1587,6 +1646,7 @@
         <w:rPr>
           <w:rFonts w:ascii="Times New Roman" w:hAnsi="Times New Roman" w:cs="Times New Roman"/>
         </w:rPr>
+        <w:lastRenderedPageBreak/>
         <w:t xml:space="preserve">A strategy is a rule that a market maker </w:t>
       </w:r>
       <w:r>
@@ -1731,7 +1791,6 @@
           <w:b/>
           <w:bCs/>
         </w:rPr>
-        <w:lastRenderedPageBreak/>
         <w:t>Weakness of the Baseline Strategy</w:t>
       </w:r>
     </w:p>
@@ -1931,6 +1990,7 @@
         <w:rPr>
           <w:rFonts w:ascii="Times New Roman" w:hAnsi="Times New Roman" w:cs="Times New Roman"/>
         </w:rPr>
+        <w:lastRenderedPageBreak/>
         <w:t>Inventory-Aware Market Maker</w:t>
       </w:r>
     </w:p>
@@ -2068,7 +2128,6 @@
         <w:rPr>
           <w:rFonts w:ascii="Times New Roman" w:hAnsi="Times New Roman" w:cs="Times New Roman"/>
         </w:rPr>
-        <w:lastRenderedPageBreak/>
         <w:t>Ask = S – kq + h</w:t>
       </w:r>
     </w:p>
@@ -2307,7 +2366,6 @@
         <w:rPr>
           <w:rFonts w:ascii="Times New Roman" w:hAnsi="Times New Roman" w:cs="Times New Roman"/>
         </w:rPr>
-        <w:lastRenderedPageBreak/>
         <w:t>Each strategy was evaluated over 20 trades using the same realised price movements and random draws. Performance was assessed using final PnL, maximum absolute inventory, and final absolute inventory.</w:t>
       </w:r>
     </w:p>
@@ -2688,7 +2746,6 @@
               <w:pStyle w:val="NormalWeb"/>
             </w:pPr>
             <w:r>
-              <w:lastRenderedPageBreak/>
               <w:t>Worst observed final PnL</w:t>
             </w:r>
           </w:p>
@@ -3022,7 +3079,6 @@
         <w:rPr>
           <w:rFonts w:ascii="Times New Roman" w:hAnsi="Times New Roman" w:cs="Times New Roman"/>
         </w:rPr>
-        <w:lastRenderedPageBreak/>
         <w:t xml:space="preserve">Each test used the same 20 trade scenario. Order and price random draws remained frozen, and all parameters were unchanged. Recordings include final PnL, maximum absolute inventory and final absolute inventory as fixed values for each value of k. </w:t>
       </w:r>
     </w:p>
@@ -3164,6 +3220,7 @@
           <w:b/>
           <w:bCs/>
         </w:rPr>
+        <w:lastRenderedPageBreak/>
         <w:t>Price Volatility</w:t>
       </w:r>
     </w:p>
@@ -3319,6 +3376,7 @@
         <w:pStyle w:val="NormalWeb"/>
       </w:pPr>
       <w:r>
+        <w:lastRenderedPageBreak/>
         <w:t>In the simulation, limits of 2, 3, 5 and 10 were compared using the same frozen scenario, with k = 0.25 and price-move size fixed at 1. Each run contained 20 customer-order opportunities.</w:t>
       </w:r>
     </w:p>
@@ -3356,7 +3414,6 @@
         <w:pStyle w:val="NormalWeb"/>
       </w:pPr>
       <w:r>
-        <w:lastRenderedPageBreak/>
         <w:t>This scenario shows a trade-off between restricting inventory exposure and accepting trading opportunities. Again, further tests would be needed to assess profitability and risk more broadly.</w:t>
       </w:r>
     </w:p>
@@ -3504,6 +3561,7 @@
         <w:pStyle w:val="NormalWeb"/>
       </w:pPr>
       <w:r>
+        <w:lastRenderedPageBreak/>
         <w:t>To address this, we test values of h of 0.5, 1, 1.5, 2. Other factors are fixed</w:t>
       </w:r>
       <w:r>
@@ -3526,7 +3584,6 @@
         <w:rPr>
           <w:noProof/>
         </w:rPr>
-        <w:lastRenderedPageBreak/>
         <w:drawing>
           <wp:inline distT="0" distB="0" distL="0" distR="0" wp14:anchorId="079DB435" wp14:editId="19517389">
             <wp:extent cx="5731510" cy="2162175"/>

</xml_diff>

<commit_message>
Enhance market maker simulation: add risk statistics calculations and visualization
</commit_message>
<xml_diff>
--- a/Final Report/Market Making and Inventory Risk - Research Report.docx
+++ b/Final Report/Market Making and Inventory Risk - Research Report.docx
@@ -2817,28 +2817,181 @@
           <w:bCs/>
         </w:rPr>
       </w:pPr>
-    </w:p>
-    <w:p>
-      <w:pPr>
+      <w:r>
         <w:rPr>
           <w:rFonts w:ascii="Times New Roman" w:hAnsi="Times New Roman" w:cs="Times New Roman"/>
           <w:b/>
           <w:bCs/>
         </w:rPr>
-      </w:pPr>
-    </w:p>
-    <w:p>
-      <w:pPr>
-        <w:pStyle w:val="Heading1"/>
-        <w:rPr>
-          <w:rFonts w:ascii="Times New Roman" w:hAnsi="Times New Roman" w:cs="Times New Roman"/>
-        </w:rPr>
-      </w:pPr>
-      <w:r>
-        <w:rPr>
-          <w:rFonts w:ascii="Times New Roman" w:hAnsi="Times New Roman" w:cs="Times New Roman"/>
-        </w:rPr>
-        <w:t>Sensitivity Analysis</w:t>
+        <w:t>Distribution of Simulation Outcomes</w:t>
+      </w:r>
+    </w:p>
+    <w:p>
+      <w:pPr>
+        <w:rPr>
+          <w:rFonts w:ascii="Times New Roman" w:hAnsi="Times New Roman" w:cs="Times New Roman"/>
+        </w:rPr>
+      </w:pPr>
+      <w:r>
+        <w:rPr>
+          <w:rFonts w:ascii="Times New Roman" w:hAnsi="Times New Roman" w:cs="Times New Roman"/>
+        </w:rPr>
+        <w:t>Averages alone do not fully describe strategy risk. 1000 paired simulations were therefore analysed as distributions. Median PnL was calculated as a measure of the typical outcome, standard deviation was used to measure variability in PnL. Proportion of negative-PnL simulations were recorded, the 5</w:t>
+      </w:r>
+      <w:r>
+        <w:rPr>
+          <w:rFonts w:ascii="Times New Roman" w:hAnsi="Times New Roman" w:cs="Times New Roman"/>
+          <w:vertAlign w:val="superscript"/>
+        </w:rPr>
+        <w:t>th</w:t>
+      </w:r>
+      <w:r>
+        <w:rPr>
+          <w:rFonts w:ascii="Times New Roman" w:hAnsi="Times New Roman" w:cs="Times New Roman"/>
+        </w:rPr>
+        <w:t xml:space="preserve"> percentile was used to examine downside outcomes without relying only on the single worst simulation. These metrics allow profitability and risk to be considered together.</w:t>
+      </w:r>
+    </w:p>
+    <w:p>
+      <w:pPr>
+        <w:rPr>
+          <w:rFonts w:ascii="Times New Roman" w:hAnsi="Times New Roman" w:cs="Times New Roman"/>
+        </w:rPr>
+      </w:pPr>
+    </w:p>
+    <w:p>
+      <w:pPr>
+        <w:rPr>
+          <w:rFonts w:ascii="Times New Roman" w:hAnsi="Times New Roman" w:cs="Times New Roman"/>
+        </w:rPr>
+      </w:pPr>
+      <w:r>
+        <w:rPr>
+          <w:rFonts w:ascii="Times New Roman" w:hAnsi="Times New Roman" w:cs="Times New Roman"/>
+        </w:rPr>
+        <w:lastRenderedPageBreak/>
+        <w:drawing>
+          <wp:inline distT="0" distB="0" distL="0" distR="0" wp14:anchorId="052D5C59" wp14:editId="23287211">
+            <wp:extent cx="2975192" cy="1848535"/>
+            <wp:effectExtent l="0" t="0" r="0" b="5715"/>
+            <wp:docPr id="834433121" name="Picture 1"/>
+            <wp:cNvGraphicFramePr>
+              <a:graphicFrameLocks xmlns:a="http://schemas.openxmlformats.org/drawingml/2006/main" noChangeAspect="1"/>
+            </wp:cNvGraphicFramePr>
+            <a:graphic xmlns:a="http://schemas.openxmlformats.org/drawingml/2006/main">
+              <a:graphicData uri="http://schemas.openxmlformats.org/drawingml/2006/picture">
+                <pic:pic xmlns:pic="http://schemas.openxmlformats.org/drawingml/2006/picture">
+                  <pic:nvPicPr>
+                    <pic:cNvPr id="834433121" name=""/>
+                    <pic:cNvPicPr/>
+                  </pic:nvPicPr>
+                  <pic:blipFill>
+                    <a:blip r:embed="rId5"/>
+                    <a:stretch>
+                      <a:fillRect/>
+                    </a:stretch>
+                  </pic:blipFill>
+                  <pic:spPr>
+                    <a:xfrm>
+                      <a:off x="0" y="0"/>
+                      <a:ext cx="3002156" cy="1865288"/>
+                    </a:xfrm>
+                    <a:prstGeom prst="rect">
+                      <a:avLst/>
+                    </a:prstGeom>
+                  </pic:spPr>
+                </pic:pic>
+              </a:graphicData>
+            </a:graphic>
+          </wp:inline>
+        </w:drawing>
+      </w:r>
+    </w:p>
+    <w:p>
+      <w:pPr>
+        <w:rPr>
+          <w:rFonts w:ascii="Times New Roman" w:hAnsi="Times New Roman" w:cs="Times New Roman"/>
+        </w:rPr>
+      </w:pPr>
+      <w:r>
+        <w:rPr>
+          <w:rFonts w:ascii="Times New Roman" w:hAnsi="Times New Roman" w:cs="Times New Roman"/>
+        </w:rPr>
+        <w:drawing>
+          <wp:inline distT="0" distB="0" distL="0" distR="0" wp14:anchorId="63F1F91D" wp14:editId="61A1EF7C">
+            <wp:extent cx="2655457" cy="2328760"/>
+            <wp:effectExtent l="0" t="0" r="0" b="0"/>
+            <wp:docPr id="828695233" name="Picture 1"/>
+            <wp:cNvGraphicFramePr>
+              <a:graphicFrameLocks xmlns:a="http://schemas.openxmlformats.org/drawingml/2006/main" noChangeAspect="1"/>
+            </wp:cNvGraphicFramePr>
+            <a:graphic xmlns:a="http://schemas.openxmlformats.org/drawingml/2006/main">
+              <a:graphicData uri="http://schemas.openxmlformats.org/drawingml/2006/picture">
+                <pic:pic xmlns:pic="http://schemas.openxmlformats.org/drawingml/2006/picture">
+                  <pic:nvPicPr>
+                    <pic:cNvPr id="828695233" name=""/>
+                    <pic:cNvPicPr/>
+                  </pic:nvPicPr>
+                  <pic:blipFill>
+                    <a:blip r:embed="rId6"/>
+                    <a:stretch>
+                      <a:fillRect/>
+                    </a:stretch>
+                  </pic:blipFill>
+                  <pic:spPr>
+                    <a:xfrm>
+                      <a:off x="0" y="0"/>
+                      <a:ext cx="2666577" cy="2338512"/>
+                    </a:xfrm>
+                    <a:prstGeom prst="rect">
+                      <a:avLst/>
+                    </a:prstGeom>
+                  </pic:spPr>
+                </pic:pic>
+              </a:graphicData>
+            </a:graphic>
+          </wp:inline>
+        </w:drawing>
+      </w:r>
+      <w:r>
+        <w:rPr>
+          <w:rFonts w:ascii="Times New Roman" w:hAnsi="Times New Roman" w:cs="Times New Roman"/>
+        </w:rPr>
+        <w:drawing>
+          <wp:inline distT="0" distB="0" distL="0" distR="0" wp14:anchorId="0244294C" wp14:editId="63F864F3">
+            <wp:extent cx="3631286" cy="2722056"/>
+            <wp:effectExtent l="0" t="0" r="1270" b="0"/>
+            <wp:docPr id="783949009" name="Picture 1"/>
+            <wp:cNvGraphicFramePr>
+              <a:graphicFrameLocks xmlns:a="http://schemas.openxmlformats.org/drawingml/2006/main" noChangeAspect="1"/>
+            </wp:cNvGraphicFramePr>
+            <a:graphic xmlns:a="http://schemas.openxmlformats.org/drawingml/2006/main">
+              <a:graphicData uri="http://schemas.openxmlformats.org/drawingml/2006/picture">
+                <pic:pic xmlns:pic="http://schemas.openxmlformats.org/drawingml/2006/picture">
+                  <pic:nvPicPr>
+                    <pic:cNvPr id="783949009" name=""/>
+                    <pic:cNvPicPr/>
+                  </pic:nvPicPr>
+                  <pic:blipFill>
+                    <a:blip r:embed="rId7"/>
+                    <a:stretch>
+                      <a:fillRect/>
+                    </a:stretch>
+                  </pic:blipFill>
+                  <pic:spPr>
+                    <a:xfrm>
+                      <a:off x="0" y="0"/>
+                      <a:ext cx="3643293" cy="2731056"/>
+                    </a:xfrm>
+                    <a:prstGeom prst="rect">
+                      <a:avLst/>
+                    </a:prstGeom>
+                  </pic:spPr>
+                </pic:pic>
+              </a:graphicData>
+            </a:graphic>
+          </wp:inline>
+        </w:drawing>
       </w:r>
     </w:p>
     <w:p>
@@ -2849,12 +3002,44 @@
           <w:bCs/>
         </w:rPr>
       </w:pPr>
-      <w:r>
+    </w:p>
+    <w:p>
+      <w:pPr>
         <w:rPr>
           <w:rFonts w:ascii="Times New Roman" w:hAnsi="Times New Roman" w:cs="Times New Roman"/>
           <w:b/>
           <w:bCs/>
         </w:rPr>
+      </w:pPr>
+    </w:p>
+    <w:p>
+      <w:pPr>
+        <w:pStyle w:val="Heading1"/>
+        <w:rPr>
+          <w:rFonts w:ascii="Times New Roman" w:hAnsi="Times New Roman" w:cs="Times New Roman"/>
+        </w:rPr>
+      </w:pPr>
+      <w:r>
+        <w:rPr>
+          <w:rFonts w:ascii="Times New Roman" w:hAnsi="Times New Roman" w:cs="Times New Roman"/>
+        </w:rPr>
+        <w:t>Sensitivity Analysis</w:t>
+      </w:r>
+    </w:p>
+    <w:p>
+      <w:pPr>
+        <w:rPr>
+          <w:rFonts w:ascii="Times New Roman" w:hAnsi="Times New Roman" w:cs="Times New Roman"/>
+          <w:b/>
+          <w:bCs/>
+        </w:rPr>
+      </w:pPr>
+      <w:r>
+        <w:rPr>
+          <w:rFonts w:ascii="Times New Roman" w:hAnsi="Times New Roman" w:cs="Times New Roman"/>
+          <w:b/>
+          <w:bCs/>
+        </w:rPr>
         <w:t>Inventory Sensitivity</w:t>
       </w:r>
     </w:p>
@@ -2868,6 +3053,7 @@
         <w:rPr>
           <w:rFonts w:ascii="Times New Roman" w:hAnsi="Times New Roman" w:cs="Times New Roman"/>
         </w:rPr>
+        <w:lastRenderedPageBreak/>
         <w:t>So far, we have mostly compared k = 0 against k = 0.25 . The parameter k controls how aggressively quotes react to inventory. When k is small, quote moves slightly, if k is large, quote moves aggressively. So, a trade-off is expected.</w:t>
       </w:r>
     </w:p>
@@ -3116,7 +3302,7 @@
                     <pic:cNvPicPr/>
                   </pic:nvPicPr>
                   <pic:blipFill>
-                    <a:blip r:embed="rId5"/>
+                    <a:blip r:embed="rId8"/>
                     <a:stretch>
                       <a:fillRect/>
                     </a:stretch>
@@ -3148,6 +3334,7 @@
           <w:rFonts w:ascii="Times New Roman" w:hAnsi="Times New Roman" w:cs="Times New Roman"/>
           <w:noProof/>
         </w:rPr>
+        <w:lastRenderedPageBreak/>
         <w:drawing>
           <wp:inline distT="0" distB="0" distL="0" distR="0" wp14:anchorId="03DA637D" wp14:editId="4F81B658">
             <wp:extent cx="5731510" cy="2131060"/>
@@ -3164,7 +3351,7 @@
                     <pic:cNvPicPr/>
                   </pic:nvPicPr>
                   <pic:blipFill>
-                    <a:blip r:embed="rId6"/>
+                    <a:blip r:embed="rId9"/>
                     <a:stretch>
                       <a:fillRect/>
                     </a:stretch>
@@ -3220,7 +3407,6 @@
           <w:b/>
           <w:bCs/>
         </w:rPr>
-        <w:lastRenderedPageBreak/>
         <w:t>Price Volatility</w:t>
       </w:r>
     </w:p>
@@ -3331,6 +3517,7 @@
         <w:pStyle w:val="NormalWeb"/>
       </w:pPr>
       <w:r>
+        <w:lastRenderedPageBreak/>
         <w:t>A new safety rule to introduce is the market maker is not allowed to exceed a chosen inventory limit.</w:t>
       </w:r>
     </w:p>
@@ -3376,7 +3563,6 @@
         <w:pStyle w:val="NormalWeb"/>
       </w:pPr>
       <w:r>
-        <w:lastRenderedPageBreak/>
         <w:t>In the simulation, limits of 2, 3, 5 and 10 were compared using the same frozen scenario, with k = 0.25 and price-move size fixed at 1. Each run contained 20 customer-order opportunities.</w:t>
       </w:r>
     </w:p>
@@ -3508,6 +3694,7 @@
         <w:pStyle w:val="NormalWeb"/>
       </w:pPr>
       <w:r>
+        <w:lastRenderedPageBreak/>
         <w:t>The question to consider is does quoting wider or tighter affect profit, trading behaviour, and inventory risk.</w:t>
       </w:r>
     </w:p>
@@ -3561,7 +3748,6 @@
         <w:pStyle w:val="NormalWeb"/>
       </w:pPr>
       <w:r>
-        <w:lastRenderedPageBreak/>
         <w:t>To address this, we test values of h of 0.5, 1, 1.5, 2. Other factors are fixed</w:t>
       </w:r>
       <w:r>
@@ -3600,7 +3786,7 @@
                     <pic:cNvPicPr/>
                   </pic:nvPicPr>
                   <pic:blipFill>
-                    <a:blip r:embed="rId7"/>
+                    <a:blip r:embed="rId10"/>
                     <a:stretch>
                       <a:fillRect/>
                     </a:stretch>

</xml_diff>

<commit_message>
Enhance market maker simulation: add scenario generation and sensitivity analysis for inventory and volatility
</commit_message>
<xml_diff>
--- a/Final Report/Market Making and Inventory Risk - Research Report.docx
+++ b/Final Report/Market Making and Inventory Risk - Research Report.docx
@@ -3811,25 +3811,249 @@
       <w:pPr>
         <w:pStyle w:val="NormalWeb"/>
       </w:pPr>
+      <w:r>
+        <w:t xml:space="preserve">It is important to note that these results do not show that wider spreads are always better. They reveal that the model lacks the reduction in customer willingness to trade that less competitive quotes would be expected to cause. </w:t>
+      </w:r>
     </w:p>
     <w:p>
       <w:pPr>
         <w:pStyle w:val="NormalWeb"/>
       </w:pPr>
-      <w:r>
-        <w:t xml:space="preserve">It is important to note that these results do not show that wider spreads are always better. They reveal that the model lacks the reduction in customer willingness to trade that less competitive quotes would be expected to cause. </w:t>
-      </w:r>
     </w:p>
     <w:p>
       <w:pPr>
         <w:pStyle w:val="NormalWeb"/>
-      </w:pPr>
+        <w:rPr>
+          <w:b/>
+          <w:bCs/>
+        </w:rPr>
+      </w:pPr>
+      <w:r>
+        <w:rPr>
+          <w:b/>
+          <w:bCs/>
+        </w:rPr>
+        <w:t>Repeated Inventory Sensitivity Analysis</w:t>
+      </w:r>
     </w:p>
     <w:p>
       <w:pPr>
         <w:pStyle w:val="NormalWeb"/>
       </w:pPr>
       <w:r>
+        <w:lastRenderedPageBreak/>
+        <w:t xml:space="preserve">The earlier inventory sensitivity experiment examined different values of k under a limited number of market paths. Python allows this to be extended across 1000 simulated scenarios. Values of k = 0, 0.1, 0.25, 0.5 and 1.0 were tested. </w:t>
+      </w:r>
+    </w:p>
+    <w:p>
+      <w:pPr>
+        <w:pStyle w:val="NormalWeb"/>
+      </w:pPr>
+      <w:r>
+        <w:t>For each value of k, average PnL, PnL standard deviation, average maximum absolute inventory, probability of loss and the 5</w:t>
+      </w:r>
+      <w:r>
+        <w:rPr>
+          <w:vertAlign w:val="superscript"/>
+        </w:rPr>
+        <w:t>th</w:t>
+      </w:r>
+      <w:r>
+        <w:t xml:space="preserve"> percentile PnL were calculated. </w:t>
+      </w:r>
+    </w:p>
+    <w:p>
+      <w:pPr>
+        <w:pStyle w:val="NormalWeb"/>
+      </w:pPr>
+      <w:r>
+        <w:drawing>
+          <wp:inline distT="0" distB="0" distL="0" distR="0" wp14:anchorId="71EDBA8A" wp14:editId="65DF7CD1">
+            <wp:extent cx="5731510" cy="1549400"/>
+            <wp:effectExtent l="0" t="0" r="0" b="0"/>
+            <wp:docPr id="515652470" name="Picture 1"/>
+            <wp:cNvGraphicFramePr>
+              <a:graphicFrameLocks xmlns:a="http://schemas.openxmlformats.org/drawingml/2006/main" noChangeAspect="1"/>
+            </wp:cNvGraphicFramePr>
+            <a:graphic xmlns:a="http://schemas.openxmlformats.org/drawingml/2006/main">
+              <a:graphicData uri="http://schemas.openxmlformats.org/drawingml/2006/picture">
+                <pic:pic xmlns:pic="http://schemas.openxmlformats.org/drawingml/2006/picture">
+                  <pic:nvPicPr>
+                    <pic:cNvPr id="515652470" name=""/>
+                    <pic:cNvPicPr/>
+                  </pic:nvPicPr>
+                  <pic:blipFill>
+                    <a:blip r:embed="rId11"/>
+                    <a:stretch>
+                      <a:fillRect/>
+                    </a:stretch>
+                  </pic:blipFill>
+                  <pic:spPr>
+                    <a:xfrm>
+                      <a:off x="0" y="0"/>
+                      <a:ext cx="5731510" cy="1549400"/>
+                    </a:xfrm>
+                    <a:prstGeom prst="rect">
+                      <a:avLst/>
+                    </a:prstGeom>
+                  </pic:spPr>
+                </pic:pic>
+              </a:graphicData>
+            </a:graphic>
+          </wp:inline>
+        </w:drawing>
+      </w:r>
+    </w:p>
+    <w:p>
+      <w:pPr>
+        <w:pStyle w:val="NormalWeb"/>
+      </w:pPr>
+      <w:r>
+        <w:t>This allows the effect of stronger inventory control to be examined in terms of both profitability and risk rather than relying on a single simulation.</w:t>
+      </w:r>
+    </w:p>
+    <w:p>
+      <w:pPr>
+        <w:pStyle w:val="NormalWeb"/>
+      </w:pPr>
+      <w:r>
+        <w:t>What each column tells us</w:t>
+      </w:r>
+    </w:p>
+    <w:p>
+      <w:pPr>
+        <w:pStyle w:val="NormalWeb"/>
+        <w:numPr>
+          <w:ilvl w:val="0"/>
+          <w:numId w:val="6"/>
+        </w:numPr>
+      </w:pPr>
+      <w:r>
+        <w:t>Avg PnL</w:t>
+      </w:r>
+    </w:p>
+    <w:p>
+      <w:pPr>
+        <w:pStyle w:val="NormalWeb"/>
+        <w:numPr>
+          <w:ilvl w:val="1"/>
+          <w:numId w:val="6"/>
+        </w:numPr>
+      </w:pPr>
+      <w:r>
+        <w:t xml:space="preserve">Typical profitability </w:t>
+      </w:r>
+    </w:p>
+    <w:p>
+      <w:pPr>
+        <w:pStyle w:val="NormalWeb"/>
+        <w:numPr>
+          <w:ilvl w:val="0"/>
+          <w:numId w:val="6"/>
+        </w:numPr>
+      </w:pPr>
+      <w:r>
+        <w:t>PnL SD</w:t>
+      </w:r>
+    </w:p>
+    <w:p>
+      <w:pPr>
+        <w:pStyle w:val="NormalWeb"/>
+        <w:numPr>
+          <w:ilvl w:val="1"/>
+          <w:numId w:val="6"/>
+        </w:numPr>
+      </w:pPr>
+      <w:r>
+        <w:t>How variable the outcomes are</w:t>
+      </w:r>
+    </w:p>
+    <w:p>
+      <w:pPr>
+        <w:pStyle w:val="NormalWeb"/>
+        <w:numPr>
+          <w:ilvl w:val="0"/>
+          <w:numId w:val="6"/>
+        </w:numPr>
+      </w:pPr>
+      <w:r>
+        <w:t>Avg Max Inv</w:t>
+      </w:r>
+    </w:p>
+    <w:p>
+      <w:pPr>
+        <w:pStyle w:val="NormalWeb"/>
+        <w:numPr>
+          <w:ilvl w:val="1"/>
+          <w:numId w:val="6"/>
+        </w:numPr>
+      </w:pPr>
+      <w:r>
+        <w:t>How far inventory tends to drift from 0</w:t>
+      </w:r>
+    </w:p>
+    <w:p>
+      <w:pPr>
+        <w:pStyle w:val="NormalWeb"/>
+        <w:numPr>
+          <w:ilvl w:val="0"/>
+          <w:numId w:val="6"/>
+        </w:numPr>
+      </w:pPr>
+      <w:r>
+        <w:t>Loss %</w:t>
+      </w:r>
+    </w:p>
+    <w:p>
+      <w:pPr>
+        <w:pStyle w:val="NormalWeb"/>
+        <w:numPr>
+          <w:ilvl w:val="1"/>
+          <w:numId w:val="6"/>
+        </w:numPr>
+      </w:pPr>
+      <w:r>
+        <w:t>Fractions of simulations where PnL &lt; 0</w:t>
+      </w:r>
+    </w:p>
+    <w:p>
+      <w:pPr>
+        <w:pStyle w:val="NormalWeb"/>
+        <w:numPr>
+          <w:ilvl w:val="0"/>
+          <w:numId w:val="6"/>
+        </w:numPr>
+      </w:pPr>
+      <w:r>
+        <w:t>5</w:t>
+      </w:r>
+      <w:r>
+        <w:rPr>
+          <w:vertAlign w:val="superscript"/>
+        </w:rPr>
+        <w:t>th</w:t>
+      </w:r>
+      <w:r>
+        <w:t xml:space="preserve"> % PnL</w:t>
+      </w:r>
+    </w:p>
+    <w:p>
+      <w:pPr>
+        <w:pStyle w:val="NormalWeb"/>
+        <w:numPr>
+          <w:ilvl w:val="1"/>
+          <w:numId w:val="6"/>
+        </w:numPr>
+      </w:pPr>
+      <w:r>
+        <w:t>A measure of bad downside outcomes without obsessing over one anomalous worst simulation</w:t>
+      </w:r>
+    </w:p>
+    <w:p>
+      <w:pPr>
+        <w:pStyle w:val="NormalWeb"/>
+      </w:pPr>
+      <w:r>
         <w:t xml:space="preserve"> </w:t>
       </w:r>
     </w:p>
@@ -3837,8 +4061,131 @@
       <w:pPr>
         <w:rPr>
           <w:rFonts w:ascii="Times New Roman" w:hAnsi="Times New Roman" w:cs="Times New Roman"/>
-        </w:rPr>
-      </w:pPr>
+          <w:b/>
+          <w:bCs/>
+        </w:rPr>
+      </w:pPr>
+      <w:r>
+        <w:rPr>
+          <w:rFonts w:ascii="Times New Roman" w:hAnsi="Times New Roman" w:cs="Times New Roman"/>
+          <w:b/>
+          <w:bCs/>
+        </w:rPr>
+        <w:t xml:space="preserve">Repeated Volatility Sensitivity Analysis </w:t>
+      </w:r>
+    </w:p>
+    <w:p>
+      <w:pPr>
+        <w:rPr>
+          <w:rFonts w:ascii="Times New Roman" w:hAnsi="Times New Roman" w:cs="Times New Roman"/>
+        </w:rPr>
+      </w:pPr>
+      <w:r>
+        <w:rPr>
+          <w:rFonts w:ascii="Times New Roman" w:hAnsi="Times New Roman" w:cs="Times New Roman"/>
+        </w:rPr>
+        <w:t xml:space="preserve">As volatility rises, PnL standard deviation tends to rise and worse downside outcomes. But the average max inventory may barely change. This is because our current quoting strategy reacts to but doesn’t </w:t>
+      </w:r>
+      <w:r>
+        <w:rPr>
+          <w:rFonts w:ascii="Times New Roman" w:hAnsi="Times New Roman" w:cs="Times New Roman"/>
+        </w:rPr>
+        <w:t>react directly to volatility. So the same amount of inventory becomes more dangerous without the market maker necessarily reducing it.</w:t>
+      </w:r>
+    </w:p>
+    <w:p>
+      <w:pPr>
+        <w:rPr>
+          <w:rFonts w:ascii="Times New Roman" w:hAnsi="Times New Roman" w:cs="Times New Roman"/>
+        </w:rPr>
+      </w:pPr>
+      <w:r>
+        <w:rPr>
+          <w:rFonts w:ascii="Times New Roman" w:hAnsi="Times New Roman" w:cs="Times New Roman"/>
+        </w:rPr>
+        <w:t xml:space="preserve">The earlier volatility experiment was extended using 1000 simulated market scenarios. Inventory sensitivity was held fixed as k = 0.25, while the magnitude of each fair-value movement was varied between 0.5, 1, 2, and 3. The direction of each price movement and the random customer draws were held constant across volatility levels, allowing the effect of price-movement magnitude to be isolated. </w:t>
+      </w:r>
+    </w:p>
+    <w:p>
+      <w:pPr>
+        <w:rPr>
+          <w:rFonts w:ascii="Times New Roman" w:hAnsi="Times New Roman" w:cs="Times New Roman"/>
+        </w:rPr>
+      </w:pPr>
+      <w:r>
+        <w:rPr>
+          <w:rFonts w:ascii="Times New Roman" w:hAnsi="Times New Roman" w:cs="Times New Roman"/>
+        </w:rPr>
+        <w:lastRenderedPageBreak/>
+        <w:t>For each level, average PnL, PnL standard deviation, average maximum absolute inventory, probability of loss and 5</w:t>
+      </w:r>
+      <w:r>
+        <w:rPr>
+          <w:rFonts w:ascii="Times New Roman" w:hAnsi="Times New Roman" w:cs="Times New Roman"/>
+          <w:vertAlign w:val="superscript"/>
+        </w:rPr>
+        <w:t>th</w:t>
+      </w:r>
+      <w:r>
+        <w:rPr>
+          <w:rFonts w:ascii="Times New Roman" w:hAnsi="Times New Roman" w:cs="Times New Roman"/>
+        </w:rPr>
+        <w:t xml:space="preserve"> percentile PnL were recorded. This allows the effect of increased market volatility on both profitability and downside risk to be examined. </w:t>
+      </w:r>
+    </w:p>
+    <w:p>
+      <w:pPr>
+        <w:rPr>
+          <w:rFonts w:ascii="Times New Roman" w:hAnsi="Times New Roman" w:cs="Times New Roman"/>
+        </w:rPr>
+      </w:pPr>
+    </w:p>
+    <w:p>
+      <w:pPr>
+        <w:rPr>
+          <w:rFonts w:ascii="Times New Roman" w:hAnsi="Times New Roman" w:cs="Times New Roman"/>
+        </w:rPr>
+      </w:pPr>
+      <w:r>
+        <w:rPr>
+          <w:rFonts w:ascii="Times New Roman" w:hAnsi="Times New Roman" w:cs="Times New Roman"/>
+        </w:rPr>
+        <w:drawing>
+          <wp:inline distT="0" distB="0" distL="0" distR="0" wp14:anchorId="2C0A72AA" wp14:editId="244C91B1">
+            <wp:extent cx="5731510" cy="1397000"/>
+            <wp:effectExtent l="0" t="0" r="0" b="0"/>
+            <wp:docPr id="1590017107" name="Picture 1"/>
+            <wp:cNvGraphicFramePr>
+              <a:graphicFrameLocks xmlns:a="http://schemas.openxmlformats.org/drawingml/2006/main" noChangeAspect="1"/>
+            </wp:cNvGraphicFramePr>
+            <a:graphic xmlns:a="http://schemas.openxmlformats.org/drawingml/2006/main">
+              <a:graphicData uri="http://schemas.openxmlformats.org/drawingml/2006/picture">
+                <pic:pic xmlns:pic="http://schemas.openxmlformats.org/drawingml/2006/picture">
+                  <pic:nvPicPr>
+                    <pic:cNvPr id="1590017107" name=""/>
+                    <pic:cNvPicPr/>
+                  </pic:nvPicPr>
+                  <pic:blipFill>
+                    <a:blip r:embed="rId12"/>
+                    <a:stretch>
+                      <a:fillRect/>
+                    </a:stretch>
+                  </pic:blipFill>
+                  <pic:spPr>
+                    <a:xfrm>
+                      <a:off x="0" y="0"/>
+                      <a:ext cx="5731510" cy="1397000"/>
+                    </a:xfrm>
+                    <a:prstGeom prst="rect">
+                      <a:avLst/>
+                    </a:prstGeom>
+                  </pic:spPr>
+                </pic:pic>
+              </a:graphicData>
+            </a:graphic>
+          </wp:inline>
+        </w:drawing>
+      </w:r>
     </w:p>
     <w:p>
       <w:pPr>

</xml_diff>

<commit_message>
Update research report: revise content in Market Making and Inventory Risk document
</commit_message>
<xml_diff>
--- a/Final Report/Market Making and Inventory Risk - Research Report.docx
+++ b/Final Report/Market Making and Inventory Risk - Research Report.docx
@@ -4189,6 +4189,149 @@
     </w:p>
     <w:p>
       <w:pPr>
+        <w:rPr>
+          <w:rFonts w:ascii="Times New Roman" w:hAnsi="Times New Roman" w:cs="Times New Roman"/>
+        </w:rPr>
+      </w:pPr>
+    </w:p>
+    <w:p>
+      <w:pPr>
+        <w:rPr>
+          <w:rFonts w:ascii="Times New Roman" w:hAnsi="Times New Roman" w:cs="Times New Roman"/>
+          <w:b/>
+          <w:bCs/>
+        </w:rPr>
+      </w:pPr>
+      <w:r>
+        <w:rPr>
+          <w:rFonts w:ascii="Times New Roman" w:hAnsi="Times New Roman" w:cs="Times New Roman"/>
+          <w:b/>
+          <w:bCs/>
+        </w:rPr>
+        <w:t>Repeated Inventory Limit Sensitivity Analysis</w:t>
+      </w:r>
+    </w:p>
+    <w:p>
+      <w:pPr>
+        <w:rPr>
+          <w:rFonts w:ascii="Times New Roman" w:hAnsi="Times New Roman" w:cs="Times New Roman"/>
+        </w:rPr>
+      </w:pPr>
+      <w:r>
+        <w:rPr>
+          <w:rFonts w:ascii="Times New Roman" w:hAnsi="Times New Roman" w:cs="Times New Roman"/>
+        </w:rPr>
+        <w:t>The question to consider is how does tightening the hard inventory limit affect risk, rejected trades and PnL across many market scenarios.</w:t>
+      </w:r>
+    </w:p>
+    <w:p>
+      <w:pPr>
+        <w:rPr>
+          <w:rFonts w:ascii="Times New Roman" w:hAnsi="Times New Roman" w:cs="Times New Roman"/>
+        </w:rPr>
+      </w:pPr>
+      <w:r>
+        <w:rPr>
+          <w:rFonts w:ascii="Times New Roman" w:hAnsi="Times New Roman" w:cs="Times New Roman"/>
+        </w:rPr>
+        <w:t>The effect of hard inventory limits was examined across 1000 simulated market scenarios. Inventory sensitivity fixed at k = 0.25, while inventory limits of 2, 3, 5 and 10 were tested.</w:t>
+      </w:r>
+    </w:p>
+    <w:p>
+      <w:pPr>
+        <w:rPr>
+          <w:rFonts w:ascii="Times New Roman" w:hAnsi="Times New Roman" w:cs="Times New Roman"/>
+        </w:rPr>
+      </w:pPr>
+      <w:r>
+        <w:rPr>
+          <w:rFonts w:ascii="Times New Roman" w:hAnsi="Times New Roman" w:cs="Times New Roman"/>
+        </w:rPr>
+        <w:t xml:space="preserve">Each limit was evaluated using the same underlying market scenarios. Average PnL, PnL standard deviation, average maximum absolute </w:t>
+      </w:r>
+      <w:r>
+        <w:rPr>
+          <w:rFonts w:ascii="Times New Roman" w:hAnsi="Times New Roman" w:cs="Times New Roman"/>
+        </w:rPr>
+        <w:t>inventory, probability of loss, 5</w:t>
+      </w:r>
+      <w:r>
+        <w:rPr>
+          <w:rFonts w:ascii="Times New Roman" w:hAnsi="Times New Roman" w:cs="Times New Roman"/>
+          <w:vertAlign w:val="superscript"/>
+        </w:rPr>
+        <w:t>th</w:t>
+      </w:r>
+      <w:r>
+        <w:rPr>
+          <w:rFonts w:ascii="Times New Roman" w:hAnsi="Times New Roman" w:cs="Times New Roman"/>
+        </w:rPr>
+        <w:t xml:space="preserve"> percentile PnL and the average number of rejected trades were recorded. This allows the reduction in inventory exposure from tighter limits to be compared against the potential cost of rejecting trading opportunities. </w:t>
+      </w:r>
+    </w:p>
+    <w:p>
+      <w:pPr>
+        <w:rPr>
+          <w:rFonts w:ascii="Times New Roman" w:hAnsi="Times New Roman" w:cs="Times New Roman"/>
+        </w:rPr>
+      </w:pPr>
+    </w:p>
+    <w:p>
+      <w:pPr>
+        <w:rPr>
+          <w:rFonts w:ascii="Times New Roman" w:hAnsi="Times New Roman" w:cs="Times New Roman"/>
+        </w:rPr>
+      </w:pPr>
+      <w:r>
+        <w:rPr>
+          <w:rFonts w:ascii="Times New Roman" w:hAnsi="Times New Roman" w:cs="Times New Roman"/>
+        </w:rPr>
+        <w:drawing>
+          <wp:inline distT="0" distB="0" distL="0" distR="0" wp14:anchorId="4CB88D4F" wp14:editId="3B44BAB1">
+            <wp:extent cx="5731510" cy="1168400"/>
+            <wp:effectExtent l="0" t="0" r="0" b="0"/>
+            <wp:docPr id="566510084" name="Picture 1"/>
+            <wp:cNvGraphicFramePr>
+              <a:graphicFrameLocks xmlns:a="http://schemas.openxmlformats.org/drawingml/2006/main" noChangeAspect="1"/>
+            </wp:cNvGraphicFramePr>
+            <a:graphic xmlns:a="http://schemas.openxmlformats.org/drawingml/2006/main">
+              <a:graphicData uri="http://schemas.openxmlformats.org/drawingml/2006/picture">
+                <pic:pic xmlns:pic="http://schemas.openxmlformats.org/drawingml/2006/picture">
+                  <pic:nvPicPr>
+                    <pic:cNvPr id="566510084" name=""/>
+                    <pic:cNvPicPr/>
+                  </pic:nvPicPr>
+                  <pic:blipFill>
+                    <a:blip r:embed="rId13"/>
+                    <a:stretch>
+                      <a:fillRect/>
+                    </a:stretch>
+                  </pic:blipFill>
+                  <pic:spPr>
+                    <a:xfrm>
+                      <a:off x="0" y="0"/>
+                      <a:ext cx="5731510" cy="1168400"/>
+                    </a:xfrm>
+                    <a:prstGeom prst="rect">
+                      <a:avLst/>
+                    </a:prstGeom>
+                  </pic:spPr>
+                </pic:pic>
+              </a:graphicData>
+            </a:graphic>
+          </wp:inline>
+        </w:drawing>
+      </w:r>
+    </w:p>
+    <w:p>
+      <w:pPr>
+        <w:rPr>
+          <w:rFonts w:ascii="Times New Roman" w:hAnsi="Times New Roman" w:cs="Times New Roman"/>
+        </w:rPr>
+      </w:pPr>
+    </w:p>
+    <w:p>
+      <w:pPr>
         <w:pStyle w:val="Heading1"/>
         <w:rPr>
           <w:rFonts w:ascii="Times New Roman" w:hAnsi="Times New Roman" w:cs="Times New Roman"/>
@@ -4198,6 +4341,7 @@
         <w:rPr>
           <w:rFonts w:ascii="Times New Roman" w:hAnsi="Times New Roman" w:cs="Times New Roman"/>
         </w:rPr>
+        <w:lastRenderedPageBreak/>
         <w:t>Discussion</w:t>
       </w:r>
     </w:p>

</xml_diff>